<commit_message>
Update project progress and timeline after P3 integration
</commit_message>
<xml_diff>
--- a/docs/NLBSE_Topic_Comparison_and_Project_Plan.docx
+++ b/docs/NLBSE_Topic_Comparison_and_Project_Plan.docx
@@ -133,11 +133,9 @@
           <w:szCs w:val="20"/>
           <w:rtl w:val="0"/>
         </w:rPr>
-        <w:t xml:space="preserve">Cập nhật: 21/08/2026</w:t>
+        <w:t>Cập nhật: 18/09/2026</w:t>
       </w:r>
-      <w:r>
-        <w:br w:type="page"/>
-      </w:r>
+      <w:r/>
       <w:r>
         <w:rPr>
           <w:rtl w:val="0"/>
@@ -2648,7 +2646,7 @@
                 <w:szCs w:val="18"/>
                 <w:rtl w:val="0"/>
               </w:rPr>
-              <w:t xml:space="preserve">Data, protocol &amp; Logistic Regression</w:t>
+              <w:t>Leader, data, protocol &amp; Logistic Regression</w:t>
             </w:r>
             <w:r>
               <w:rPr>
@@ -3566,7 +3564,7 @@
           <w:color w:val="1F4E78"/>
           <w:sz w:val="17"/>
         </w:rPr>
-        <w:t>Cập nhật 24/08/2026: P1 đã hoàn tất nền tảng chung và baseline; P2-P5 có thể bắt đầu module riêng. Official test vẫn đang khóa.</w:t>
+        <w:t>Cập nhật 18/09/2026: P2-P4 đã merge; P3 có 100 artifacts hợp lệ, P4 có 175 CV artifacts. Còn tổng hợp, final evaluation và demo. Các ngày dưới đây là mốc kế hoạch ban đầu, không phải lịch hoàn thành thực tế.</w:t>
       </w:r>
     </w:p>
     <w:tbl>
@@ -3868,7 +3866,7 @@
                 <w:sz w:val="15"/>
               </w:rPr>
               <w:br/>
-              <w:t>P1 xong; P2-P5 sẵn sàng bắt đầu</w:t>
+              <w:t>Nền tảng, LR và model adapters đã tích hợp</w:t>
             </w:r>
           </w:p>
         </w:tc>
@@ -3999,7 +3997,7 @@
                 <w:color w:val="375523"/>
                 <w:sz w:val="15"/>
               </w:rPr>
-              <w:t>HOÀN THÀNH P1</w:t>
+              <w:t>HOÀN THÀNH</w:t>
             </w:r>
             <w:r>
               <w:rPr>
@@ -4009,7 +4007,7 @@
                 <w:sz w:val="15"/>
               </w:rPr>
               <w:br/>
-              <w:t>Pipeline, LR, audit và profiler đã chạy</w:t>
+              <w:t>P2-P4 đã merge; P5 có utilities</w:t>
             </w:r>
           </w:p>
         </w:tc>
@@ -4140,7 +4138,7 @@
                 <w:color w:val="7F6000"/>
                 <w:sz w:val="15"/>
               </w:rPr>
-              <w:t>ĐANG THỰC HIỆN</w:t>
+              <w:t>MỘT PHẦN</w:t>
             </w:r>
             <w:r>
               <w:rPr>
@@ -4150,7 +4148,7 @@
                 <w:sz w:val="15"/>
               </w:rPr>
               <w:br/>
-              <w:t>P1 xong CV + ablation; chưa grid tune</w:t>
+              <w:t>P1-P4 có CV; cần chốt cấu hình cuối chung</w:t>
             </w:r>
           </w:p>
         </w:tc>
@@ -4291,7 +4289,7 @@
                 <w:sz w:val="15"/>
               </w:rPr>
               <w:br/>
-              <w:t>P1 xong LOO; chờ model và ensemble</w:t>
+              <w:t>P1/P2 có LOO; P3 có pooled; còn ensemble</w:t>
             </w:r>
           </w:p>
         </w:tc>
@@ -4407,7 +4405,7 @@
               <w:bottom w:w="80.0" w:type="dxa"/>
             </w:tcMar>
             <w:vAlign w:val="center"/>
-            <w:shd w:fill="E7E6E6"/>
+            <w:shd w:fill="FFF2CC"/>
           </w:tcPr>
           <w:p>
             <w:pPr>
@@ -4419,10 +4417,10 @@
               <w:rPr>
                 <w:rFonts w:ascii="Arial" w:hAnsi="Arial"/>
                 <w:b/>
-                <w:color w:val="595959"/>
+                <w:color w:val="7F6000"/>
                 <w:sz w:val="15"/>
               </w:rPr>
-              <w:t>CHƯA BẮT ĐẦU</w:t>
+              <w:t>MỘT PHẦN</w:t>
             </w:r>
             <w:r>
               <w:rPr>
@@ -4432,7 +4430,7 @@
                 <w:sz w:val="15"/>
               </w:rPr>
               <w:br/>
-              <w:t>Official test đang khóa</w:t>
+              <w:t>P2 đã báo cáo official; còn tổng hợp và benchmark chung</w:t>
             </w:r>
           </w:p>
         </w:tc>
@@ -4573,7 +4571,7 @@
                 <w:sz w:val="15"/>
               </w:rPr>
               <w:br/>
-              <w:t>P1 có báo cáo ban đầu</w:t>
+              <w:t>P1-P4 có findings; P5 cần hợp nhất bảng và report</w:t>
             </w:r>
           </w:p>
         </w:tc>
@@ -4714,7 +4712,7 @@
                 <w:sz w:val="15"/>
               </w:rPr>
               <w:br/>
-              <w:t>README + CI xong; chờ demo</w:t>
+              <w:t>CI xanh; còn fresh-clone, demo và rehearsal</w:t>
             </w:r>
           </w:p>
         </w:tc>

</xml_diff>